<commit_message>
Frameworks comparison and characteristics Screenshot comparisons 22Jun
</commit_message>
<xml_diff>
--- a/ReferenceMaterials/Timeout settings in Playwright.docx
+++ b/ReferenceMaterials/Timeout settings in Playwright.docx
@@ -83,7 +83,7 @@
       </w:r>
       <w:proofErr w:type="spellEnd"/>
       <w:r>
-        <w:t>(120000); // 2 minutes</w:t>
+        <w:t>(12000); // 2 minutes</w:t>
       </w:r>
     </w:p>
     <w:p>
@@ -94,7 +94,7 @@
     <w:p>
       <w:r>
         <w:pict w14:anchorId="05B79C6D">
-          <v:rect id="_x0000_i1055" style="width:0;height:1.5pt" o:hralign="center" o:hrstd="t" o:hr="t" fillcolor="#a0a0a0" stroked="f"/>
+          <v:rect id="_x0000_i1025" style="width:0;height:1.5pt" o:hralign="center" o:hrstd="t" o:hr="t" fillcolor="#a0a0a0" stroked="f"/>
         </w:pict>
       </w:r>
     </w:p>
@@ -193,7 +193,7 @@
     <w:p>
       <w:r>
         <w:pict w14:anchorId="6FF8C136">
-          <v:rect id="_x0000_i1056" style="width:0;height:1.5pt" o:hralign="center" o:hrstd="t" o:hr="t" fillcolor="#a0a0a0" stroked="f"/>
+          <v:rect id="_x0000_i1026" style="width:0;height:1.5pt" o:hralign="center" o:hrstd="t" o:hr="t" fillcolor="#a0a0a0" stroked="f"/>
         </w:pict>
       </w:r>
     </w:p>
@@ -254,7 +254,7 @@
     <w:p>
       <w:r>
         <w:pict w14:anchorId="351916A0">
-          <v:rect id="_x0000_i1057" style="width:0;height:1.5pt" o:hralign="center" o:hrstd="t" o:hr="t" fillcolor="#a0a0a0" stroked="f"/>
+          <v:rect id="_x0000_i1027" style="width:0;height:1.5pt" o:hralign="center" o:hrstd="t" o:hr="t" fillcolor="#a0a0a0" stroked="f"/>
         </w:pict>
       </w:r>
     </w:p>
@@ -361,7 +361,7 @@
     <w:p>
       <w:r>
         <w:pict w14:anchorId="1E85C215">
-          <v:rect id="_x0000_i1058" style="width:0;height:1.5pt" o:hralign="center" o:hrstd="t" o:hr="t" fillcolor="#a0a0a0" stroked="f"/>
+          <v:rect id="_x0000_i1028" style="width:0;height:1.5pt" o:hralign="center" o:hrstd="t" o:hr="t" fillcolor="#a0a0a0" stroked="f"/>
         </w:pict>
       </w:r>
     </w:p>
@@ -411,7 +411,7 @@
     <w:p>
       <w:r>
         <w:pict w14:anchorId="0C735DD3">
-          <v:rect id="_x0000_i1059" style="width:0;height:1.5pt" o:hralign="center" o:hrstd="t" o:hr="t" fillcolor="#a0a0a0" stroked="f"/>
+          <v:rect id="_x0000_i1029" style="width:0;height:1.5pt" o:hralign="center" o:hrstd="t" o:hr="t" fillcolor="#a0a0a0" stroked="f"/>
         </w:pict>
       </w:r>
     </w:p>
@@ -1245,6 +1245,7 @@
   <w:style w:type="character" w:default="1" w:styleId="DefaultParagraphFont">
     <w:name w:val="Default Paragraph Font"/>
     <w:uiPriority w:val="1"/>
+    <w:semiHidden/>
     <w:unhideWhenUsed/>
   </w:style>
   <w:style w:type="table" w:default="1" w:styleId="TableNormal">

</xml_diff>